<commit_message>
Update manuscript: correct refs 8 and 35 citations and terminology
- Fix ref 8 (He T et al.) title/authors/DOI; confirm 58% safety-defect figure
- Fix ref 35 (Haag D et al.) title/authors; add CHI 2025 DOI
- Align 'exercise prescription' to 'exercise recommendation' to match sources
- Update Kim 2024 descriptor (completed RCT, not underway)

Co-Authored-By: Claude Code <noreply@anthropic.com>
</commit_message>
<xml_diff>
--- a/paper/VitalLens_manuscript_draft.docx
+++ b/paper/VitalLens_manuscript_draft.docx
@@ -219,7 +219,7 @@
         <w:t xml:space="preserve"> </w:t>
       </w:r>
       <w:r>
-        <w:t xml:space="preserve">Home-based cardiopulmonary telerehabilitation improves program completion and is noninferior to center-based programs, but it still depends on dedicated heart-rate (HR) hardware, and the growing use of large language models (LLMs) for exercise prescription introduces new safety risks: 14 of 24 (58%) published studies using LLMs for exercise prescription reported safety defects such as contraindicated exercise. Consumer cameras can measure HR by remote photoplethysmography (rPPG), but camera HR during exercise is corrupted by periodic motion, and there is no established mechanism that lets a non-expert exercise at home with camera-derived vital signs while bounding what an LLM planner may say or do.</w:t>
+        <w:t xml:space="preserve">Home-based cardiopulmonary telerehabilitation improves program completion and is noninferior to center-based programs, but it still depends on dedicated heart-rate (HR) hardware, and the growing use of large language models (LLMs) for exercise recommendation introduces new safety risks: 14 of 24 (58%) published studies using LLMs for exercise recommendation reported safety defects such as contraindicated exercise. Consumer cameras can measure HR by remote photoplethysmography (rPPG), but camera HR during exercise is corrupted by periodic motion, and there is no established mechanism that lets a non-expert exercise at home with camera-derived vital signs while bounding what an LLM planner may say or do.</w:t>
       </w:r>
     </w:p>
     <w:p>
@@ -354,7 +354,7 @@
         <w:pStyle w:val="BodyText"/>
       </w:pPr>
       <w:r>
-        <w:t xml:space="preserve">Two further problems motivate this work. First, remote delivery does not remove cost but shifts it. In an Australian equivalence trial of chronic respiratory disease, per-person program cost moved from the patient to the health system when care went remote (patient burden A$1,298 center vs A$554 remote; health-system burden A$529 vs A$1,601), so sustaining remote care requires lowering provider-side cost, and passing device purchases to the patient erodes the very access benefit remote care was meant to create [7]. A heart-rate monitor that requires no dedicated hardware is therefore attractive. Second, LLMs are increasingly used to generate exercise prescriptions, and this creates a distinct safety risk: a 2026 review found that 14 of 24 (58%) studies applying LLMs to exercise prescription reported safety defects such as contraindicated exercise [8]. The field is already scaling remote delivery: a randomized trial of telerehabilitation in post-discharge COVID-19 patients improved the 6-minute walk distance [9], meta-analyses support telerehabilitation effectiveness during the pandemic [10], multicenter randomized trials of digital therapeutics for pulmonary rehabilitation are underway [11], and South Korea’s temporary telemedicine policy demonstrated chronic-disease management at national scale [12].</w:t>
+        <w:t xml:space="preserve">Two further problems motivate this work. First, remote delivery does not remove cost but shifts it. In an Australian equivalence trial of chronic respiratory disease, per-person program cost moved from the patient to the health system when care went remote (patient burden A$1,298 center vs A$554 remote; health-system burden A$529 vs A$1,601), so sustaining remote care requires lowering provider-side cost, and passing device purchases to the patient erodes the very access benefit remote care was meant to create [7]. A heart-rate monitor that requires no dedicated hardware is therefore attractive. Second, LLMs are increasingly used to generate exercise recommendations, and this creates a distinct safety risk: a 2026 review found that 14 of 24 (58%) studies applying LLMs to exercise recommendation reported safety defects such as contraindicated exercise [8]. The field is already scaling remote delivery: a randomized trial of telerehabilitation in post-discharge COVID-19 patients improved the 6-minute walk distance [9], meta-analyses support telerehabilitation effectiveness during the pandemic [10], a multicenter randomized controlled trial of a digital therapeutic for pulmonary rehabilitation has been reported [11], and South Korea’s temporary telemedicine policy demonstrated chronic-disease management at national scale [12].</w:t>
       </w:r>
     </w:p>
     <w:p>
@@ -1320,7 +1320,7 @@
         <w:t xml:space="preserve"> </w:t>
       </w:r>
       <w:r>
-        <w:t xml:space="preserve">webcam conditions show substantially lower correlation (r ≈ 0.58 in one online study) and a tendency to underestimate HR [32]; VitalLens’s still-check-in design and its withholding behavior are consistent with, and a response to, this gap. Prior cardiac-rehabilitation prototypes such as SRCardioCare establish feasibility of app-based home exercise but rely on manual vital entry and identified manual data entry as a limitation [33]; VitalLens removes the dedicated HR device but deliberately retains the pulse oximeter for COPD. The safety-kernel approach responds directly to the 58% safety-defect rate in LLM exercise-prescription studies [8] and to prior work evaluating an LLM’s decisions about timely intervention in cardiac rehabilitation [35]; it aligns with the EU AI Act’s requirement for human oversight and the ability to disregard or interrupt AI output [34] and with national guidance on the review of generative-AI medical devices [36], although no regulation mandates a deterministic rule layer as such; it is a design response to human-oversight and risk-management obligations.</w:t>
+        <w:t xml:space="preserve">webcam conditions show substantially lower correlation (r ≈ 0.58 in one online study) and a tendency to underestimate HR [32]; VitalLens’s still-check-in design and its withholding behavior are consistent with, and a response to, this gap. Prior cardiac-rehabilitation prototypes such as SRCardioCare establish feasibility of app-based home exercise but rely on manual vital entry and identified manual data entry as a limitation [33]; VitalLens removes the dedicated HR device but deliberately retains the pulse oximeter for COPD. The safety-kernel approach responds directly to the 58% safety-defect rate in LLM exercise-recommendation studies [8] and to prior work evaluating an LLM’s decisions about timely intervention in cardiac rehabilitation [35]; it aligns with the EU AI Act’s requirement for human oversight and the ability to disregard or interrupt AI output [34] and with national guidance on the review of generative-AI medical devices [36], although no regulation mandates a deterministic rule layer as such; it is a design response to human-oversight and risk-management obligations.</w:t>
       </w:r>
     </w:p>
     <w:bookmarkEnd w:id="34"/>
@@ -3374,7 +3374,7 @@
         </w:numPr>
       </w:pPr>
       <w:r>
-        <w:t xml:space="preserve">He Y, et al. Large language models for exercise prescription: a systematic review of safety. Biol Sport. 2026. [PMCID: PMC13343266 — verify identifier]</w:t>
+        <w:t xml:space="preserve">He T, Lu D, Ma Y, He J, Li D, Li G, Sun J. The AI recommendation paradox: a systematic review evaluating the promise, peril, and path forward for large language models in exercise recommendation. Biol Sport. 2026;43:949-970. doi:10.5114/biolsport.2026.158676</w:t>
       </w:r>
     </w:p>
     <w:p>
@@ -3716,7 +3716,7 @@
         </w:numPr>
       </w:pPr>
       <w:r>
-        <w:t xml:space="preserve">Haag C, et al. Evaluating an LLM’s decisions about timely intervention in cardiac rehabilitation. In: Proceedings of the 2025 CHI Conference on Human Factors in Computing Systems. 2025. https://arxiv.org/abs/2402.08658</w:t>
+        <w:t xml:space="preserve">Haag D, Kumar D, Gruber S, Hofer D, Sareban M, Treff G, Niebauer J, Bull C, Schmidt A, Smeddinck JD. The Last JITAI? Exploring large language models for issuing just-in-time adaptive interventions: fostering physical activity in a conceptual cardiac rehabilitation setting. In: Proceedings of the 2025 CHI Conference on Human Factors in Computing Systems. 2025. doi:10.1145/3706598.3713307</w:t>
       </w:r>
     </w:p>
     <w:p>
@@ -3907,25 +3907,7 @@
         <w:t xml:space="preserve"> </w:t>
       </w:r>
       <w:r>
-        <w:t xml:space="preserve">— verify the identifier. The website’s PMCID (PMC13343266) did not resolve; search PubMed for</w:t>
-      </w:r>
-      <w:r>
-        <w:t xml:space="preserve"> </w:t>
-      </w:r>
-      <w:r>
-        <w:t xml:space="preserve">“</w:t>
-      </w:r>
-      <w:r>
-        <w:t xml:space="preserve">large language models exercise prescription safety</w:t>
-      </w:r>
-      <w:r>
-        <w:t xml:space="preserve">”</w:t>
-      </w:r>
-      <w:r>
-        <w:t xml:space="preserve"> </w:t>
-      </w:r>
-      <w:r>
-        <w:t xml:space="preserve">and update the DOI/PMCID and full author list.</w:t>
+        <w:t xml:space="preserve">— RESOLVED (2026-10-07). Full citation corrected and the 58% safety-defect figure confirmed against the abstract: He T, Lu D, Ma Y, He J, Li D, Li G, Sun J. The AI recommendation paradox: a systematic review evaluating the promise, peril, and path forward for large language models in exercise recommendation. Biol Sport. 2026;43:949-970. doi:10.5114/biolsport.2026.158676.</w:t>
       </w:r>
     </w:p>
     <w:p>

</xml_diff>

<commit_message>
Correct hallucinated figures in refs 1/2/7 against source abstracts
- Cox 2021: 15 studies/1904 participants, completion 93% vs 70%, 6MWD MD 0.06 m (was '3 RCTs/516, OR 5.36')
- Li L 2025: +24.74 m is vs usual care; center-based shows no significant difference
- Burge 2025: total 12-month cost no significant difference (MD A$565) (was unverified cost-shift figures)
- Add source-verification notes for refs 1/2/3/7

Co-Authored-By: Claude Code <noreply@anthropic.com>
</commit_message>
<xml_diff>
--- a/paper/VitalLens_manuscript_draft.docx
+++ b/paper/VitalLens_manuscript_draft.docx
@@ -346,7 +346,7 @@
         <w:pStyle w:val="FirstParagraph"/>
       </w:pPr>
       <w:r>
-        <w:t xml:space="preserve">Cardiac and pulmonary rehabilitation are among the strongest evidence bases in rehabilitation medicine, yet completion and uptake remain low for structural rather than efficacy reasons [1]. Center-based programs require 2–3 weekly visits over 8–12 weeks, a design that concentrates dropout at every step from referral through completion, especially for patients facing distance, transport, work, or dyspnea. Home-based (remote) delivery addresses this: a Cochrane review of primary telerehabilitation versus center-based pulmonary rehabilitation (3 randomized controlled trials, 516 participants) reported completion of 93% versus 70% (odds ratio 5.36, 95% CI 3.12–9.21) [1]. Home-based cardiac rehabilitation delivered by mobile health is noninferior to center-based care, with a 6-minute walk distance (6MWT) mean difference of +24.74 m (95% CI 9.88–39.60) [2], and remote pulmonary rehabilitation is comparable to center-based (6MWT mean difference −5.37 m, 95% CI −15.68 to 4.95) [3]. However, the safety literature cautions against generalizing these findings to unattended sessions: in one systematic review, adverse events occurred in 0.31% of 65,352 sessions, but 92% of the included studies used human-delivered safety measures such as vital-sign monitoring and safety checklists [4], and a separate scoping review found the most adverse events (including angina and syncope) in cardiac rehabilitation studies [5]. For context, a 25-m improvement in 6MWT is the accepted minimal clinically important difference in cardiac rehabilitation [6].</w:t>
+        <w:t xml:space="preserve">Cardiac and pulmonary rehabilitation are among the strongest evidence bases in rehabilitation medicine, yet completion and uptake remain low for structural rather than efficacy reasons [1]. Center-based programs require 2–3 weekly visits over 8–12 weeks, a design that concentrates dropout at every step from referral through completion, especially for patients facing distance, transport, work, or dyspnea. Home-based (remote) delivery addresses this: a Cochrane review of telerehabilitation versus center-based pulmonary rehabilitation (15 studies, 1,904 participants) reported completion of 93% versus 70% and little or no difference in exercise capacity (6MWD mean difference 0.06 m, 95% CI −10.82 to 10.94) [1]. Home-based cardiac rehabilitation delivered by mobile health improves 6MWT versus usual care (mean difference +24.74 m, 95% CI 9.88–39.60) and shows no significant difference versus center-based care [2], and remote pulmonary rehabilitation is comparable to center-based (6MWT mean difference −5.37 m, 95% CI −15.68 to 4.95) [3]. However, the safety literature cautions against generalizing these findings to unattended sessions: in one systematic review, adverse events occurred in 0.31% of 65,352 sessions, but 92% of the included studies used human-delivered safety measures such as vital-sign monitoring and safety checklists [4], and a separate scoping review found the most adverse events (including angina and syncope) in cardiac rehabilitation studies [5]. For context, a 25-m improvement in 6MWT is the accepted minimal clinically important difference in cardiac rehabilitation [6].</w:t>
       </w:r>
     </w:p>
     <w:p>
@@ -354,7 +354,7 @@
         <w:pStyle w:val="BodyText"/>
       </w:pPr>
       <w:r>
-        <w:t xml:space="preserve">Two further problems motivate this work. First, remote delivery does not remove cost but shifts it. In an Australian equivalence trial of chronic respiratory disease, per-person program cost moved from the patient to the health system when care went remote (patient burden A$1,298 center vs A$554 remote; health-system burden A$529 vs A$1,601), so sustaining remote care requires lowering provider-side cost, and passing device purchases to the patient erodes the very access benefit remote care was meant to create [7]. A heart-rate monitor that requires no dedicated hardware is therefore attractive. Second, LLMs are increasingly used to generate exercise recommendations, and this creates a distinct safety risk: a 2026 review found that 14 of 24 (58%) studies applying LLMs to exercise recommendation reported safety defects such as contraindicated exercise [8]. The field is already scaling remote delivery: a randomized trial of telerehabilitation in post-discharge COVID-19 patients improved the 6-minute walk distance [9], meta-analyses support telerehabilitation effectiveness during the pandemic [10], a multicenter randomized controlled trial of a digital therapeutic for pulmonary rehabilitation has been reported [11], and South Korea’s temporary telemedicine policy demonstrated chronic-disease management at national scale [12].</w:t>
+        <w:t xml:space="preserve">Two further problems motivate this work. First, remote delivery does not remove cost. In an Australian economic analysis alongside an equivalence trial of chronic respiratory disease, telerehabilitation was cost-effective and equivalent to center-based pulmonary rehabilitation with no significant between-group difference in total 12-month costs (mean difference A$565), but it still requires synchronous supervision and equipment, so sustaining remote care depends on minimizing provider-side and technology cost, and passing device purchases to the patient erodes the very access benefit remote care was meant to create [7]. A heart-rate monitor that requires no dedicated hardware is therefore attractive. Second, LLMs are increasingly used to generate exercise recommendations, and this creates a distinct safety risk: a 2026 review found that 14 of 24 (58%) studies applying LLMs to exercise recommendation reported safety defects such as contraindicated exercise [8]. The field is already scaling remote delivery: a randomized trial of telerehabilitation in post-discharge COVID-19 patients improved the 6-minute walk distance [9], meta-analyses support telerehabilitation effectiveness during the pandemic [10], a multicenter randomized controlled trial of a digital therapeutic for pulmonary rehabilitation has been reported [11], and South Korea’s temporary telemedicine policy demonstrated chronic-disease management at national scale [12].</w:t>
       </w:r>
     </w:p>
     <w:p>

</xml_diff>